<commit_message>
new lbi_plot and table functions
</commit_message>
<xml_diff>
--- a/LBI/LBI_Table.docx
+++ b/LBI/LBI_Table.docx
@@ -9,23 +9,413 @@
         <w:tblLook w:firstRow="1" w:lastRow="0" w:firstColumn="0" w:lastColumn="0" w:noHBand="0" w:noVBand="1"/>
       </w:tblPr>
       <w:tblGrid>
-        <w:gridCol w:w="891"/>
-        <w:gridCol w:w="1223"/>
-        <w:gridCol w:w="1343"/>
-        <w:gridCol w:w="1583"/>
-        <w:gridCol w:w="1011"/>
-        <w:gridCol w:w="1583"/>
-        <w:gridCol w:w="1577"/>
+        <w:gridCol w:w="1491"/>
+        <w:gridCol w:w="1122"/>
+        <w:gridCol w:w="1245"/>
+        <w:gridCol w:w="1389"/>
+        <w:gridCol w:w="1044"/>
+        <w:gridCol w:w="1467"/>
+        <w:gridCol w:w="1595"/>
       </w:tblGrid>
       <w:tr>
         <w:trPr>
-          <w:trHeight w:val="578" w:hRule="auto"/>
+          <w:trHeight w:val="598" w:hRule="auto"/>
           <w:tblHeader/>
         </w:trPr>
         <w:tc>
           <w:tcPr>
             <w:tcBorders>
               <w:bottom w:val="single" w:sz="12" w:space="0" w:color="666666"/>
+              <w:top w:val="single" w:sz="12" w:space="0" w:color="666666"/>
+              <w:left w:val="none" w:sz="0" w:space="0" w:color="000000"/>
+              <w:right w:val="none" w:sz="0" w:space="0" w:color="000000"/>
+            </w:tcBorders>
+            <w:shd w:val="clear" w:color="auto" w:fill="FFFFFF"/>
+            <w:tcMar>
+              <w:top w:w="0" w:type="dxa"/>
+              <w:bottom w:w="0" w:type="dxa"/>
+              <w:left w:w="0" w:type="dxa"/>
+              <w:right w:w="0" w:type="dxa"/>
+            </w:tcMar>
+            <w:vAlign w:val="center"/>
+          </w:tcPr>
+          <w:p>
+            <w:pPr>
+              <w:pStyle w:val="Normal"/>
+              <w:jc w:val="left"/>
+              <w:pBdr>
+                <w:bottom w:val="none" w:sz="0" w:space="0" w:color="000000"/>
+                <w:top w:val="none" w:sz="0" w:space="0" w:color="000000"/>
+                <w:left w:val="none" w:sz="0" w:space="0" w:color="000000"/>
+                <w:right w:val="none" w:sz="0" w:space="0" w:color="000000"/>
+              </w:pBdr>
+              <w:spacing w:after="100" w:before="100" w:line="240"/>
+              <w:ind w:left="100" w:right="100" w:firstLine="0" w:firstLineChars="0"/>
+              <w:rPr>
+                <w:rFonts w:ascii="Calibri" w:hAnsi="Calibri" w:eastAsia="Calibri" w:cs="Calibri"/>
+                <w:i w:val="false"/>
+                <w:b w:val="false"/>
+                <w:u w:val="none"/>
+                <w:strike w:val="false"/>
+                <w:sz w:val="20"/>
+                <w:szCs w:val="20"/>
+                <w:color w:val="000000"/>
+              </w:rPr>
+            </w:pPr>
+            <w:r>
+              <w:rPr>
+                <w:rFonts w:ascii="Calibri" w:hAnsi="Calibri" w:eastAsia="Calibri" w:cs="Calibri"/>
+                <w:i w:val="false"/>
+                <w:b w:val="false"/>
+                <w:u w:val="none"/>
+                <w:strike w:val="false"/>
+                <w:sz w:val="20"/>
+                <w:szCs w:val="20"/>
+                <w:color w:val="000000"/>
+              </w:rPr>
+              <w:t xml:space="preserve">Year</w:t>
+            </w:r>
+          </w:p>
+        </w:tc>
+        <w:tc>
+          <w:tcPr>
+            <w:tcBorders>
+              <w:bottom w:val="single" w:sz="12" w:space="0" w:color="666666"/>
+              <w:top w:val="single" w:sz="12" w:space="0" w:color="666666"/>
+              <w:left w:val="none" w:sz="0" w:space="0" w:color="000000"/>
+              <w:right w:val="none" w:sz="0" w:space="0" w:color="000000"/>
+            </w:tcBorders>
+            <w:shd w:val="clear" w:color="auto" w:fill="FFFFFF"/>
+            <w:tcMar>
+              <w:top w:w="0" w:type="dxa"/>
+              <w:bottom w:w="0" w:type="dxa"/>
+              <w:left w:w="0" w:type="dxa"/>
+              <w:right w:w="0" w:type="dxa"/>
+            </w:tcMar>
+            <w:vAlign w:val="center"/>
+          </w:tcPr>
+          <w:p>
+            <w:pPr>
+              <w:pStyle w:val="Normal"/>
+              <w:jc w:val="left"/>
+              <w:pBdr>
+                <w:bottom w:val="none" w:sz="0" w:space="0" w:color="000000"/>
+                <w:top w:val="none" w:sz="0" w:space="0" w:color="000000"/>
+                <w:left w:val="none" w:sz="0" w:space="0" w:color="000000"/>
+                <w:right w:val="none" w:sz="0" w:space="0" w:color="000000"/>
+              </w:pBdr>
+              <w:spacing w:after="100" w:before="100" w:line="240"/>
+              <w:ind w:left="100" w:right="100" w:firstLine="0" w:firstLineChars="0"/>
+              <w:rPr>
+                <w:rFonts w:ascii="Calibri" w:hAnsi="Calibri" w:eastAsia="Calibri" w:cs="Calibri"/>
+                <w:i w:val="false"/>
+                <w:b w:val="false"/>
+                <w:u w:val="none"/>
+                <w:strike w:val="false"/>
+                <w:sz w:val="20"/>
+                <w:szCs w:val="20"/>
+                <w:color w:val="000000"/>
+              </w:rPr>
+            </w:pPr>
+            <w:r>
+              <w:rPr>
+                <w:rFonts w:ascii="Calibri" w:hAnsi="Calibri" w:eastAsia="Calibri" w:cs="Calibri"/>
+                <w:i w:val="false"/>
+                <w:b w:val="false"/>
+                <w:u w:val="none"/>
+                <w:strike w:val="false"/>
+                <w:sz w:val="20"/>
+                <w:szCs w:val="20"/>
+                <w:color w:val="000000"/>
+              </w:rPr>
+              <w:t xml:space="preserve">Lc/Lmat</w:t>
+            </w:r>
+          </w:p>
+        </w:tc>
+        <w:tc>
+          <w:tcPr>
+            <w:tcBorders>
+              <w:bottom w:val="single" w:sz="12" w:space="0" w:color="666666"/>
+              <w:top w:val="single" w:sz="12" w:space="0" w:color="666666"/>
+              <w:left w:val="none" w:sz="0" w:space="0" w:color="000000"/>
+              <w:right w:val="none" w:sz="0" w:space="0" w:color="000000"/>
+            </w:tcBorders>
+            <w:shd w:val="clear" w:color="auto" w:fill="FFFFFF"/>
+            <w:tcMar>
+              <w:top w:w="0" w:type="dxa"/>
+              <w:bottom w:w="0" w:type="dxa"/>
+              <w:left w:w="0" w:type="dxa"/>
+              <w:right w:w="0" w:type="dxa"/>
+            </w:tcMar>
+            <w:vAlign w:val="center"/>
+          </w:tcPr>
+          <w:p>
+            <w:pPr>
+              <w:pStyle w:val="Normal"/>
+              <w:jc w:val="left"/>
+              <w:pBdr>
+                <w:bottom w:val="none" w:sz="0" w:space="0" w:color="000000"/>
+                <w:top w:val="none" w:sz="0" w:space="0" w:color="000000"/>
+                <w:left w:val="none" w:sz="0" w:space="0" w:color="000000"/>
+                <w:right w:val="none" w:sz="0" w:space="0" w:color="000000"/>
+              </w:pBdr>
+              <w:spacing w:after="100" w:before="100" w:line="240"/>
+              <w:ind w:left="100" w:right="100" w:firstLine="0" w:firstLineChars="0"/>
+              <w:rPr>
+                <w:rFonts w:ascii="Calibri" w:hAnsi="Calibri" w:eastAsia="Calibri" w:cs="Calibri"/>
+                <w:i w:val="false"/>
+                <w:b w:val="false"/>
+                <w:u w:val="none"/>
+                <w:strike w:val="false"/>
+                <w:sz w:val="20"/>
+                <w:szCs w:val="20"/>
+                <w:color w:val="000000"/>
+              </w:rPr>
+            </w:pPr>
+            <w:r>
+              <w:rPr>
+                <w:rFonts w:ascii="Calibri" w:hAnsi="Calibri" w:eastAsia="Calibri" w:cs="Calibri"/>
+                <w:i w:val="false"/>
+                <w:b w:val="false"/>
+                <w:u w:val="none"/>
+                <w:strike w:val="false"/>
+                <w:sz w:val="20"/>
+                <w:szCs w:val="20"/>
+                <w:color w:val="000000"/>
+              </w:rPr>
+              <w:t xml:space="preserve">L25/Lmat</w:t>
+            </w:r>
+          </w:p>
+        </w:tc>
+        <w:tc>
+          <w:tcPr>
+            <w:tcBorders>
+              <w:bottom w:val="single" w:sz="12" w:space="0" w:color="666666"/>
+              <w:top w:val="single" w:sz="12" w:space="0" w:color="666666"/>
+              <w:left w:val="none" w:sz="0" w:space="0" w:color="000000"/>
+              <w:right w:val="none" w:sz="0" w:space="0" w:color="000000"/>
+            </w:tcBorders>
+            <w:shd w:val="clear" w:color="auto" w:fill="FFFFFF"/>
+            <w:tcMar>
+              <w:top w:w="0" w:type="dxa"/>
+              <w:bottom w:w="0" w:type="dxa"/>
+              <w:left w:w="0" w:type="dxa"/>
+              <w:right w:w="0" w:type="dxa"/>
+            </w:tcMar>
+            <w:vAlign w:val="center"/>
+          </w:tcPr>
+          <w:p>
+            <w:pPr>
+              <w:pStyle w:val="Normal"/>
+              <w:jc w:val="left"/>
+              <w:pBdr>
+                <w:bottom w:val="none" w:sz="0" w:space="0" w:color="000000"/>
+                <w:top w:val="none" w:sz="0" w:space="0" w:color="000000"/>
+                <w:left w:val="none" w:sz="0" w:space="0" w:color="000000"/>
+                <w:right w:val="none" w:sz="0" w:space="0" w:color="000000"/>
+              </w:pBdr>
+              <w:spacing w:after="100" w:before="100" w:line="240"/>
+              <w:ind w:left="100" w:right="100" w:firstLine="0" w:firstLineChars="0"/>
+              <w:rPr>
+                <w:rFonts w:ascii="Calibri" w:hAnsi="Calibri" w:eastAsia="Calibri" w:cs="Calibri"/>
+                <w:i w:val="false"/>
+                <w:b w:val="false"/>
+                <w:u w:val="none"/>
+                <w:strike w:val="false"/>
+                <w:sz w:val="20"/>
+                <w:szCs w:val="20"/>
+                <w:color w:val="000000"/>
+              </w:rPr>
+            </w:pPr>
+            <w:r>
+              <w:rPr>
+                <w:rFonts w:ascii="Calibri" w:hAnsi="Calibri" w:eastAsia="Calibri" w:cs="Calibri"/>
+                <w:i w:val="false"/>
+                <w:b w:val="false"/>
+                <w:u w:val="none"/>
+                <w:strike w:val="false"/>
+                <w:sz w:val="20"/>
+                <w:szCs w:val="20"/>
+                <w:color w:val="000000"/>
+              </w:rPr>
+              <w:t xml:space="preserve">Lmax5/Linf</w:t>
+            </w:r>
+          </w:p>
+        </w:tc>
+        <w:tc>
+          <w:tcPr>
+            <w:tcBorders>
+              <w:bottom w:val="single" w:sz="12" w:space="0" w:color="666666"/>
+              <w:top w:val="single" w:sz="12" w:space="0" w:color="666666"/>
+              <w:left w:val="none" w:sz="0" w:space="0" w:color="000000"/>
+              <w:right w:val="none" w:sz="0" w:space="0" w:color="000000"/>
+            </w:tcBorders>
+            <w:shd w:val="clear" w:color="auto" w:fill="FFFFFF"/>
+            <w:tcMar>
+              <w:top w:w="0" w:type="dxa"/>
+              <w:bottom w:w="0" w:type="dxa"/>
+              <w:left w:w="0" w:type="dxa"/>
+              <w:right w:w="0" w:type="dxa"/>
+            </w:tcMar>
+            <w:vAlign w:val="center"/>
+          </w:tcPr>
+          <w:p>
+            <w:pPr>
+              <w:pStyle w:val="Normal"/>
+              <w:jc w:val="left"/>
+              <w:pBdr>
+                <w:bottom w:val="none" w:sz="0" w:space="0" w:color="000000"/>
+                <w:top w:val="none" w:sz="0" w:space="0" w:color="000000"/>
+                <w:left w:val="none" w:sz="0" w:space="0" w:color="000000"/>
+                <w:right w:val="none" w:sz="0" w:space="0" w:color="000000"/>
+              </w:pBdr>
+              <w:spacing w:after="100" w:before="100" w:line="240"/>
+              <w:ind w:left="100" w:right="100" w:firstLine="0" w:firstLineChars="0"/>
+              <w:rPr>
+                <w:rFonts w:ascii="Calibri" w:hAnsi="Calibri" w:eastAsia="Calibri" w:cs="Calibri"/>
+                <w:i w:val="false"/>
+                <w:b w:val="false"/>
+                <w:u w:val="none"/>
+                <w:strike w:val="false"/>
+                <w:sz w:val="20"/>
+                <w:szCs w:val="20"/>
+                <w:color w:val="000000"/>
+              </w:rPr>
+            </w:pPr>
+            <w:r>
+              <w:rPr>
+                <w:rFonts w:ascii="Calibri" w:hAnsi="Calibri" w:eastAsia="Calibri" w:cs="Calibri"/>
+                <w:i w:val="false"/>
+                <w:b w:val="false"/>
+                <w:u w:val="none"/>
+                <w:strike w:val="false"/>
+                <w:sz w:val="20"/>
+                <w:szCs w:val="20"/>
+                <w:color w:val="000000"/>
+              </w:rPr>
+              <w:t xml:space="preserve">Pmega</w:t>
+            </w:r>
+          </w:p>
+        </w:tc>
+        <w:tc>
+          <w:tcPr>
+            <w:tcBorders>
+              <w:bottom w:val="single" w:sz="12" w:space="0" w:color="666666"/>
+              <w:top w:val="single" w:sz="12" w:space="0" w:color="666666"/>
+              <w:left w:val="none" w:sz="0" w:space="0" w:color="000000"/>
+              <w:right w:val="none" w:sz="0" w:space="0" w:color="000000"/>
+            </w:tcBorders>
+            <w:shd w:val="clear" w:color="auto" w:fill="FFFFFF"/>
+            <w:tcMar>
+              <w:top w:w="0" w:type="dxa"/>
+              <w:bottom w:w="0" w:type="dxa"/>
+              <w:left w:w="0" w:type="dxa"/>
+              <w:right w:w="0" w:type="dxa"/>
+            </w:tcMar>
+            <w:vAlign w:val="center"/>
+          </w:tcPr>
+          <w:p>
+            <w:pPr>
+              <w:pStyle w:val="Normal"/>
+              <w:jc w:val="left"/>
+              <w:pBdr>
+                <w:bottom w:val="none" w:sz="0" w:space="0" w:color="000000"/>
+                <w:top w:val="none" w:sz="0" w:space="0" w:color="000000"/>
+                <w:left w:val="none" w:sz="0" w:space="0" w:color="000000"/>
+                <w:right w:val="none" w:sz="0" w:space="0" w:color="000000"/>
+              </w:pBdr>
+              <w:spacing w:after="100" w:before="100" w:line="240"/>
+              <w:ind w:left="100" w:right="100" w:firstLine="0" w:firstLineChars="0"/>
+              <w:rPr>
+                <w:rFonts w:ascii="Calibri" w:hAnsi="Calibri" w:eastAsia="Calibri" w:cs="Calibri"/>
+                <w:i w:val="false"/>
+                <w:b w:val="false"/>
+                <w:u w:val="none"/>
+                <w:strike w:val="false"/>
+                <w:sz w:val="20"/>
+                <w:szCs w:val="20"/>
+                <w:color w:val="000000"/>
+              </w:rPr>
+            </w:pPr>
+            <w:r>
+              <w:rPr>
+                <w:rFonts w:ascii="Calibri" w:hAnsi="Calibri" w:eastAsia="Calibri" w:cs="Calibri"/>
+                <w:i w:val="false"/>
+                <w:b w:val="false"/>
+                <w:u w:val="none"/>
+                <w:strike w:val="false"/>
+                <w:sz w:val="20"/>
+                <w:szCs w:val="20"/>
+                <w:color w:val="000000"/>
+              </w:rPr>
+              <w:t xml:space="preserve">Lmean/Lopt</w:t>
+            </w:r>
+          </w:p>
+        </w:tc>
+        <w:tc>
+          <w:tcPr>
+            <w:tcBorders>
+              <w:bottom w:val="single" w:sz="12" w:space="0" w:color="666666"/>
+              <w:top w:val="single" w:sz="12" w:space="0" w:color="666666"/>
+              <w:left w:val="none" w:sz="0" w:space="0" w:color="000000"/>
+              <w:right w:val="none" w:sz="0" w:space="0" w:color="000000"/>
+            </w:tcBorders>
+            <w:shd w:val="clear" w:color="auto" w:fill="FFFFFF"/>
+            <w:tcMar>
+              <w:top w:w="0" w:type="dxa"/>
+              <w:bottom w:w="0" w:type="dxa"/>
+              <w:left w:w="0" w:type="dxa"/>
+              <w:right w:w="0" w:type="dxa"/>
+            </w:tcMar>
+            <w:vAlign w:val="center"/>
+          </w:tcPr>
+          <w:p>
+            <w:pPr>
+              <w:pStyle w:val="Normal"/>
+              <w:jc w:val="left"/>
+              <w:pBdr>
+                <w:bottom w:val="none" w:sz="0" w:space="0" w:color="000000"/>
+                <w:top w:val="none" w:sz="0" w:space="0" w:color="000000"/>
+                <w:left w:val="none" w:sz="0" w:space="0" w:color="000000"/>
+                <w:right w:val="none" w:sz="0" w:space="0" w:color="000000"/>
+              </w:pBdr>
+              <w:spacing w:after="100" w:before="100" w:line="240"/>
+              <w:ind w:left="100" w:right="100" w:firstLine="0" w:firstLineChars="0"/>
+              <w:rPr>
+                <w:rFonts w:ascii="Calibri" w:hAnsi="Calibri" w:eastAsia="Calibri" w:cs="Calibri"/>
+                <w:i w:val="false"/>
+                <w:b w:val="false"/>
+                <w:u w:val="none"/>
+                <w:strike w:val="false"/>
+                <w:sz w:val="20"/>
+                <w:szCs w:val="20"/>
+                <w:color w:val="000000"/>
+              </w:rPr>
+            </w:pPr>
+            <w:r>
+              <w:rPr>
+                <w:rFonts w:ascii="Calibri" w:hAnsi="Calibri" w:eastAsia="Calibri" w:cs="Calibri"/>
+                <w:i w:val="false"/>
+                <w:b w:val="false"/>
+                <w:u w:val="none"/>
+                <w:strike w:val="false"/>
+                <w:sz w:val="20"/>
+                <w:szCs w:val="20"/>
+                <w:color w:val="000000"/>
+              </w:rPr>
+              <w:t xml:space="preserve">Lmean/LF=M</w:t>
+            </w:r>
+          </w:p>
+        </w:tc>
+      </w:tr>
+      <w:tr>
+        <w:trPr>
+          <w:trHeight w:val="556" w:hRule="auto"/>
+        </w:trPr>
+        <w:tc>
+          <w:tcPr>
+            <w:tcBorders>
+              <w:bottom w:val="single" w:sz="12" w:space="0" w:color="000000"/>
               <w:top w:val="single" w:sz="12" w:space="0" w:color="666666"/>
               <w:left w:val="none" w:sz="0" w:space="0" w:color="000000"/>
               <w:right w:val="none" w:sz="0" w:space="0" w:color="000000"/>
@@ -42,7 +432,7 @@
           <w:p>
             <w:pPr>
               <w:pStyle w:val="Normal"/>
-              <w:jc w:val="center"/>
+              <w:jc w:val="left"/>
               <w:pBdr>
                 <w:bottom w:val="none" w:sz="0" w:space="0" w:color="000000"/>
                 <w:top w:val="none" w:sz="0" w:space="0" w:color="000000"/>
@@ -73,14 +463,14 @@
                 <w:szCs w:val="20"/>
                 <w:color w:val="000000"/>
               </w:rPr>
-              <w:t xml:space="preserve">Year</w:t>
+              <w:t xml:space="preserve">Reference</w:t>
             </w:r>
           </w:p>
         </w:tc>
         <w:tc>
           <w:tcPr>
             <w:tcBorders>
-              <w:bottom w:val="single" w:sz="12" w:space="0" w:color="666666"/>
+              <w:bottom w:val="single" w:sz="12" w:space="0" w:color="000000"/>
               <w:top w:val="single" w:sz="12" w:space="0" w:color="666666"/>
               <w:left w:val="none" w:sz="0" w:space="0" w:color="000000"/>
               <w:right w:val="none" w:sz="0" w:space="0" w:color="000000"/>
@@ -97,7 +487,7 @@
           <w:p>
             <w:pPr>
               <w:pStyle w:val="Normal"/>
-              <w:jc w:val="center"/>
+              <w:jc w:val="left"/>
               <w:pBdr>
                 <w:bottom w:val="none" w:sz="0" w:space="0" w:color="000000"/>
                 <w:top w:val="none" w:sz="0" w:space="0" w:color="000000"/>
@@ -128,14 +518,14 @@
                 <w:szCs w:val="20"/>
                 <w:color w:val="000000"/>
               </w:rPr>
-              <w:t xml:space="preserve">Lc/Lmat</w:t>
+              <w:t xml:space="preserve">&gt;1.00</w:t>
             </w:r>
           </w:p>
         </w:tc>
         <w:tc>
           <w:tcPr>
             <w:tcBorders>
-              <w:bottom w:val="single" w:sz="12" w:space="0" w:color="666666"/>
+              <w:bottom w:val="single" w:sz="12" w:space="0" w:color="000000"/>
               <w:top w:val="single" w:sz="12" w:space="0" w:color="666666"/>
               <w:left w:val="none" w:sz="0" w:space="0" w:color="000000"/>
               <w:right w:val="none" w:sz="0" w:space="0" w:color="000000"/>
@@ -152,7 +542,7 @@
           <w:p>
             <w:pPr>
               <w:pStyle w:val="Normal"/>
-              <w:jc w:val="center"/>
+              <w:jc w:val="left"/>
               <w:pBdr>
                 <w:bottom w:val="none" w:sz="0" w:space="0" w:color="000000"/>
                 <w:top w:val="none" w:sz="0" w:space="0" w:color="000000"/>
@@ -183,14 +573,14 @@
                 <w:szCs w:val="20"/>
                 <w:color w:val="000000"/>
               </w:rPr>
-              <w:t xml:space="preserve">L25/Lmat</w:t>
+              <w:t xml:space="preserve">&gt;1.00</w:t>
             </w:r>
           </w:p>
         </w:tc>
         <w:tc>
           <w:tcPr>
             <w:tcBorders>
-              <w:bottom w:val="single" w:sz="12" w:space="0" w:color="666666"/>
+              <w:bottom w:val="single" w:sz="12" w:space="0" w:color="000000"/>
               <w:top w:val="single" w:sz="12" w:space="0" w:color="666666"/>
               <w:left w:val="none" w:sz="0" w:space="0" w:color="000000"/>
               <w:right w:val="none" w:sz="0" w:space="0" w:color="000000"/>
@@ -207,7 +597,7 @@
           <w:p>
             <w:pPr>
               <w:pStyle w:val="Normal"/>
-              <w:jc w:val="center"/>
+              <w:jc w:val="left"/>
               <w:pBdr>
                 <w:bottom w:val="none" w:sz="0" w:space="0" w:color="000000"/>
                 <w:top w:val="none" w:sz="0" w:space="0" w:color="000000"/>
@@ -238,14 +628,14 @@
                 <w:szCs w:val="20"/>
                 <w:color w:val="000000"/>
               </w:rPr>
-              <w:t xml:space="preserve">Lmax5/Linf</w:t>
+              <w:t xml:space="preserve">&gt;0.80</w:t>
             </w:r>
           </w:p>
         </w:tc>
         <w:tc>
           <w:tcPr>
             <w:tcBorders>
-              <w:bottom w:val="single" w:sz="12" w:space="0" w:color="666666"/>
+              <w:bottom w:val="single" w:sz="12" w:space="0" w:color="000000"/>
               <w:top w:val="single" w:sz="12" w:space="0" w:color="666666"/>
               <w:left w:val="none" w:sz="0" w:space="0" w:color="000000"/>
               <w:right w:val="none" w:sz="0" w:space="0" w:color="000000"/>
@@ -262,7 +652,7 @@
           <w:p>
             <w:pPr>
               <w:pStyle w:val="Normal"/>
-              <w:jc w:val="center"/>
+              <w:jc w:val="left"/>
               <w:pBdr>
                 <w:bottom w:val="none" w:sz="0" w:space="0" w:color="000000"/>
                 <w:top w:val="none" w:sz="0" w:space="0" w:color="000000"/>
@@ -293,14 +683,14 @@
                 <w:szCs w:val="20"/>
                 <w:color w:val="000000"/>
               </w:rPr>
-              <w:t xml:space="preserve">Pmega</w:t>
+              <w:t xml:space="preserve">&gt;0.30</w:t>
             </w:r>
           </w:p>
         </w:tc>
         <w:tc>
           <w:tcPr>
             <w:tcBorders>
-              <w:bottom w:val="single" w:sz="12" w:space="0" w:color="666666"/>
+              <w:bottom w:val="single" w:sz="12" w:space="0" w:color="000000"/>
               <w:top w:val="single" w:sz="12" w:space="0" w:color="666666"/>
               <w:left w:val="none" w:sz="0" w:space="0" w:color="000000"/>
               <w:right w:val="none" w:sz="0" w:space="0" w:color="000000"/>
@@ -317,7 +707,7 @@
           <w:p>
             <w:pPr>
               <w:pStyle w:val="Normal"/>
-              <w:jc w:val="center"/>
+              <w:jc w:val="left"/>
               <w:pBdr>
                 <w:bottom w:val="none" w:sz="0" w:space="0" w:color="000000"/>
                 <w:top w:val="none" w:sz="0" w:space="0" w:color="000000"/>
@@ -348,14 +738,14 @@
                 <w:szCs w:val="20"/>
                 <w:color w:val="000000"/>
               </w:rPr>
-              <w:t xml:space="preserve">Lmean/Lopt</w:t>
+              <w:t xml:space="preserve">≈0.90</w:t>
             </w:r>
           </w:p>
         </w:tc>
         <w:tc>
           <w:tcPr>
             <w:tcBorders>
-              <w:bottom w:val="single" w:sz="12" w:space="0" w:color="666666"/>
+              <w:bottom w:val="single" w:sz="12" w:space="0" w:color="000000"/>
               <w:top w:val="single" w:sz="12" w:space="0" w:color="666666"/>
               <w:left w:val="none" w:sz="0" w:space="0" w:color="000000"/>
               <w:right w:val="none" w:sz="0" w:space="0" w:color="000000"/>
@@ -372,7 +762,7 @@
           <w:p>
             <w:pPr>
               <w:pStyle w:val="Normal"/>
-              <w:jc w:val="center"/>
+              <w:jc w:val="left"/>
               <w:pBdr>
                 <w:bottom w:val="none" w:sz="0" w:space="0" w:color="000000"/>
                 <w:top w:val="none" w:sz="0" w:space="0" w:color="000000"/>
@@ -403,7 +793,7 @@
                 <w:szCs w:val="20"/>
                 <w:color w:val="000000"/>
               </w:rPr>
-              <w:t xml:space="preserve">Lmean/LF=M</w:t>
+              <w:t xml:space="preserve">≥1.00</w:t>
             </w:r>
           </w:p>
         </w:tc>
@@ -416,7 +806,7 @@
           <w:tcPr>
             <w:tcBorders>
               <w:bottom w:val="none" w:sz="0" w:space="0" w:color="000000"/>
-              <w:top w:val="single" w:sz="12" w:space="0" w:color="666666"/>
+              <w:top w:val="single" w:sz="12" w:space="0" w:color="000000"/>
               <w:left w:val="none" w:sz="0" w:space="0" w:color="000000"/>
               <w:right w:val="none" w:sz="0" w:space="0" w:color="000000"/>
             </w:tcBorders>
@@ -432,7 +822,7 @@
           <w:p>
             <w:pPr>
               <w:pStyle w:val="Normal"/>
-              <w:jc w:val="center"/>
+              <w:jc w:val="left"/>
               <w:pBdr>
                 <w:bottom w:val="none" w:sz="0" w:space="0" w:color="000000"/>
                 <w:top w:val="none" w:sz="0" w:space="0" w:color="000000"/>
@@ -471,7 +861,7 @@
           <w:tcPr>
             <w:tcBorders>
               <w:bottom w:val="none" w:sz="0" w:space="0" w:color="000000"/>
-              <w:top w:val="single" w:sz="12" w:space="0" w:color="666666"/>
+              <w:top w:val="single" w:sz="12" w:space="0" w:color="000000"/>
               <w:left w:val="none" w:sz="0" w:space="0" w:color="000000"/>
               <w:right w:val="none" w:sz="0" w:space="0" w:color="000000"/>
             </w:tcBorders>
@@ -487,7 +877,7 @@
           <w:p>
             <w:pPr>
               <w:pStyle w:val="Normal"/>
-              <w:jc w:val="center"/>
+              <w:jc w:val="left"/>
               <w:pBdr>
                 <w:bottom w:val="none" w:sz="0" w:space="0" w:color="000000"/>
                 <w:top w:val="none" w:sz="0" w:space="0" w:color="000000"/>
@@ -526,7 +916,7 @@
           <w:tcPr>
             <w:tcBorders>
               <w:bottom w:val="none" w:sz="0" w:space="0" w:color="000000"/>
-              <w:top w:val="single" w:sz="12" w:space="0" w:color="666666"/>
+              <w:top w:val="single" w:sz="12" w:space="0" w:color="000000"/>
               <w:left w:val="none" w:sz="0" w:space="0" w:color="000000"/>
               <w:right w:val="none" w:sz="0" w:space="0" w:color="000000"/>
             </w:tcBorders>
@@ -542,7 +932,7 @@
           <w:p>
             <w:pPr>
               <w:pStyle w:val="Normal"/>
-              <w:jc w:val="center"/>
+              <w:jc w:val="left"/>
               <w:pBdr>
                 <w:bottom w:val="none" w:sz="0" w:space="0" w:color="000000"/>
                 <w:top w:val="none" w:sz="0" w:space="0" w:color="000000"/>
@@ -581,7 +971,7 @@
           <w:tcPr>
             <w:tcBorders>
               <w:bottom w:val="none" w:sz="0" w:space="0" w:color="000000"/>
-              <w:top w:val="single" w:sz="12" w:space="0" w:color="666666"/>
+              <w:top w:val="single" w:sz="12" w:space="0" w:color="000000"/>
               <w:left w:val="none" w:sz="0" w:space="0" w:color="000000"/>
               <w:right w:val="none" w:sz="0" w:space="0" w:color="000000"/>
             </w:tcBorders>
@@ -597,7 +987,7 @@
           <w:p>
             <w:pPr>
               <w:pStyle w:val="Normal"/>
-              <w:jc w:val="center"/>
+              <w:jc w:val="left"/>
               <w:pBdr>
                 <w:bottom w:val="none" w:sz="0" w:space="0" w:color="000000"/>
                 <w:top w:val="none" w:sz="0" w:space="0" w:color="000000"/>
@@ -636,7 +1026,7 @@
           <w:tcPr>
             <w:tcBorders>
               <w:bottom w:val="none" w:sz="0" w:space="0" w:color="000000"/>
-              <w:top w:val="single" w:sz="12" w:space="0" w:color="666666"/>
+              <w:top w:val="single" w:sz="12" w:space="0" w:color="000000"/>
               <w:left w:val="none" w:sz="0" w:space="0" w:color="000000"/>
               <w:right w:val="none" w:sz="0" w:space="0" w:color="000000"/>
             </w:tcBorders>
@@ -652,7 +1042,7 @@
           <w:p>
             <w:pPr>
               <w:pStyle w:val="Normal"/>
-              <w:jc w:val="center"/>
+              <w:jc w:val="left"/>
               <w:pBdr>
                 <w:bottom w:val="none" w:sz="0" w:space="0" w:color="000000"/>
                 <w:top w:val="none" w:sz="0" w:space="0" w:color="000000"/>
@@ -683,7 +1073,7 @@
                 <w:szCs w:val="20"/>
                 <w:color w:val="000000"/>
               </w:rPr>
-              <w:t xml:space="preserve">0.00</w:t>
+              <w:t xml:space="preserve">0</w:t>
             </w:r>
           </w:p>
         </w:tc>
@@ -691,7 +1081,7 @@
           <w:tcPr>
             <w:tcBorders>
               <w:bottom w:val="none" w:sz="0" w:space="0" w:color="000000"/>
-              <w:top w:val="single" w:sz="12" w:space="0" w:color="666666"/>
+              <w:top w:val="single" w:sz="12" w:space="0" w:color="000000"/>
               <w:left w:val="none" w:sz="0" w:space="0" w:color="000000"/>
               <w:right w:val="none" w:sz="0" w:space="0" w:color="000000"/>
             </w:tcBorders>
@@ -707,7 +1097,7 @@
           <w:p>
             <w:pPr>
               <w:pStyle w:val="Normal"/>
-              <w:jc w:val="center"/>
+              <w:jc w:val="left"/>
               <w:pBdr>
                 <w:bottom w:val="none" w:sz="0" w:space="0" w:color="000000"/>
                 <w:top w:val="none" w:sz="0" w:space="0" w:color="000000"/>
@@ -746,7 +1136,7 @@
           <w:tcPr>
             <w:tcBorders>
               <w:bottom w:val="none" w:sz="0" w:space="0" w:color="000000"/>
-              <w:top w:val="single" w:sz="12" w:space="0" w:color="666666"/>
+              <w:top w:val="single" w:sz="12" w:space="0" w:color="000000"/>
               <w:left w:val="none" w:sz="0" w:space="0" w:color="000000"/>
               <w:right w:val="none" w:sz="0" w:space="0" w:color="000000"/>
             </w:tcBorders>
@@ -762,7 +1152,7 @@
           <w:p>
             <w:pPr>
               <w:pStyle w:val="Normal"/>
-              <w:jc w:val="center"/>
+              <w:jc w:val="left"/>
               <w:pBdr>
                 <w:bottom w:val="none" w:sz="0" w:space="0" w:color="000000"/>
                 <w:top w:val="none" w:sz="0" w:space="0" w:color="000000"/>
@@ -822,7 +1212,7 @@
           <w:p>
             <w:pPr>
               <w:pStyle w:val="Normal"/>
-              <w:jc w:val="center"/>
+              <w:jc w:val="left"/>
               <w:pBdr>
                 <w:bottom w:val="none" w:sz="0" w:space="0" w:color="000000"/>
                 <w:top w:val="none" w:sz="0" w:space="0" w:color="000000"/>
@@ -877,7 +1267,7 @@
           <w:p>
             <w:pPr>
               <w:pStyle w:val="Normal"/>
-              <w:jc w:val="center"/>
+              <w:jc w:val="left"/>
               <w:pBdr>
                 <w:bottom w:val="none" w:sz="0" w:space="0" w:color="000000"/>
                 <w:top w:val="none" w:sz="0" w:space="0" w:color="000000"/>
@@ -932,7 +1322,7 @@
           <w:p>
             <w:pPr>
               <w:pStyle w:val="Normal"/>
-              <w:jc w:val="center"/>
+              <w:jc w:val="left"/>
               <w:pBdr>
                 <w:bottom w:val="none" w:sz="0" w:space="0" w:color="000000"/>
                 <w:top w:val="none" w:sz="0" w:space="0" w:color="000000"/>
@@ -987,7 +1377,7 @@
           <w:p>
             <w:pPr>
               <w:pStyle w:val="Normal"/>
-              <w:jc w:val="center"/>
+              <w:jc w:val="left"/>
               <w:pBdr>
                 <w:bottom w:val="none" w:sz="0" w:space="0" w:color="000000"/>
                 <w:top w:val="none" w:sz="0" w:space="0" w:color="000000"/>
@@ -1042,7 +1432,7 @@
           <w:p>
             <w:pPr>
               <w:pStyle w:val="Normal"/>
-              <w:jc w:val="center"/>
+              <w:jc w:val="left"/>
               <w:pBdr>
                 <w:bottom w:val="none" w:sz="0" w:space="0" w:color="000000"/>
                 <w:top w:val="none" w:sz="0" w:space="0" w:color="000000"/>
@@ -1073,7 +1463,7 @@
                 <w:szCs w:val="20"/>
                 <w:color w:val="000000"/>
               </w:rPr>
-              <w:t xml:space="preserve">0.00</w:t>
+              <w:t xml:space="preserve">0</w:t>
             </w:r>
           </w:p>
         </w:tc>
@@ -1097,7 +1487,7 @@
           <w:p>
             <w:pPr>
               <w:pStyle w:val="Normal"/>
-              <w:jc w:val="center"/>
+              <w:jc w:val="left"/>
               <w:pBdr>
                 <w:bottom w:val="none" w:sz="0" w:space="0" w:color="000000"/>
                 <w:top w:val="none" w:sz="0" w:space="0" w:color="000000"/>
@@ -1152,7 +1542,7 @@
           <w:p>
             <w:pPr>
               <w:pStyle w:val="Normal"/>
-              <w:jc w:val="center"/>
+              <w:jc w:val="left"/>
               <w:pBdr>
                 <w:bottom w:val="none" w:sz="0" w:space="0" w:color="000000"/>
                 <w:top w:val="none" w:sz="0" w:space="0" w:color="000000"/>
@@ -1183,7 +1573,7 @@
                 <w:szCs w:val="20"/>
                 <w:color w:val="000000"/>
               </w:rPr>
-              <w:t xml:space="preserve">0.90</w:t>
+              <w:t xml:space="preserve">0.9</w:t>
             </w:r>
           </w:p>
         </w:tc>
@@ -1212,7 +1602,7 @@
           <w:p>
             <w:pPr>
               <w:pStyle w:val="Normal"/>
-              <w:jc w:val="center"/>
+              <w:jc w:val="left"/>
               <w:pBdr>
                 <w:bottom w:val="none" w:sz="0" w:space="0" w:color="000000"/>
                 <w:top w:val="none" w:sz="0" w:space="0" w:color="000000"/>
@@ -1267,7 +1657,7 @@
           <w:p>
             <w:pPr>
               <w:pStyle w:val="Normal"/>
-              <w:jc w:val="center"/>
+              <w:jc w:val="left"/>
               <w:pBdr>
                 <w:bottom w:val="none" w:sz="0" w:space="0" w:color="000000"/>
                 <w:top w:val="none" w:sz="0" w:space="0" w:color="000000"/>
@@ -1322,7 +1712,7 @@
           <w:p>
             <w:pPr>
               <w:pStyle w:val="Normal"/>
-              <w:jc w:val="center"/>
+              <w:jc w:val="left"/>
               <w:pBdr>
                 <w:bottom w:val="none" w:sz="0" w:space="0" w:color="000000"/>
                 <w:top w:val="none" w:sz="0" w:space="0" w:color="000000"/>
@@ -1377,7 +1767,7 @@
           <w:p>
             <w:pPr>
               <w:pStyle w:val="Normal"/>
-              <w:jc w:val="center"/>
+              <w:jc w:val="left"/>
               <w:pBdr>
                 <w:bottom w:val="none" w:sz="0" w:space="0" w:color="000000"/>
                 <w:top w:val="none" w:sz="0" w:space="0" w:color="000000"/>
@@ -1432,7 +1822,7 @@
           <w:p>
             <w:pPr>
               <w:pStyle w:val="Normal"/>
-              <w:jc w:val="center"/>
+              <w:jc w:val="left"/>
               <w:pBdr>
                 <w:bottom w:val="none" w:sz="0" w:space="0" w:color="000000"/>
                 <w:top w:val="none" w:sz="0" w:space="0" w:color="000000"/>
@@ -1487,7 +1877,7 @@
           <w:p>
             <w:pPr>
               <w:pStyle w:val="Normal"/>
-              <w:jc w:val="center"/>
+              <w:jc w:val="left"/>
               <w:pBdr>
                 <w:bottom w:val="none" w:sz="0" w:space="0" w:color="000000"/>
                 <w:top w:val="none" w:sz="0" w:space="0" w:color="000000"/>
@@ -1542,7 +1932,7 @@
           <w:p>
             <w:pPr>
               <w:pStyle w:val="Normal"/>
-              <w:jc w:val="center"/>
+              <w:jc w:val="left"/>
               <w:pBdr>
                 <w:bottom w:val="none" w:sz="0" w:space="0" w:color="000000"/>
                 <w:top w:val="none" w:sz="0" w:space="0" w:color="000000"/>
@@ -1573,7 +1963,7 @@
                 <w:szCs w:val="20"/>
                 <w:color w:val="000000"/>
               </w:rPr>
-              <w:t xml:space="preserve">0.90</w:t>
+              <w:t xml:space="preserve">0.9</w:t>
             </w:r>
           </w:p>
         </w:tc>

</xml_diff>